<commit_message>
Add DropLine task and evaluation references
</commit_message>
<xml_diff>
--- a/projects/dropline-connect-four/DropLine_Feature_Verifier_Spec.docx
+++ b/projects/dropline-connect-four/DropLine_Feature_Verifier_Spec.docx
@@ -634,7 +634,7 @@
         <w:keepLines/>
       </w:pPr>
       <w:r>
-        <w:t>Reloading an unfinished or completed round restores the exact visible state. Restoring a completed round does not record its score again. Malformed or incompatible saved data opens as a clean match instead of breaking startup.</w:t>
+        <w:t>Reloading an unfinished or completed round restores the exact visible state. Restoring a completed round does not record its score again.</w:t>
       </w:r>
     </w:p>
     <w:p>
@@ -740,17 +740,7 @@
             <w:vAlign w:val="center"/>
           </w:tcPr>
           <w:p>
-            <w:pPr>
-              <w:spacing w:after="0"/>
-            </w:pPr>
-            <w:r/>
             <w:r>
-              <w:rPr>
-                <w:rFonts w:ascii="Aptos" w:hAnsi="Aptos"/>
-                <w:b w:val="0"/>
-                <w:color w:val="344054"/>
-                <w:sz w:val="14"/>
-              </w:rPr>
               <w:t>Bootstrap and board</w:t>
             </w:r>
           </w:p>
@@ -761,18 +751,8 @@
             <w:vAlign w:val="center"/>
           </w:tcPr>
           <w:p>
-            <w:pPr>
-              <w:spacing w:after="0"/>
-            </w:pPr>
-            <w:r/>
             <w:r>
-              <w:rPr>
-                <w:rFonts w:ascii="Aptos" w:hAnsi="Aptos"/>
-                <w:b w:val="0"/>
-                <w:color w:val="344054"/>
-                <w:sz w:val="14"/>
-              </w:rPr>
-              <w:t>Exact board</w:t>
+              <w:t>Accessible board</w:t>
             </w:r>
           </w:p>
         </w:tc>
@@ -782,18 +762,8 @@
             <w:vAlign w:val="center"/>
           </w:tcPr>
           <w:p>
-            <w:pPr>
-              <w:spacing w:after="0"/>
-            </w:pPr>
-            <w:r/>
             <w:r>
-              <w:rPr>
-                <w:rFonts w:ascii="Aptos" w:hAnsi="Aptos"/>
-                <w:b w:val="0"/>
-                <w:color w:val="344054"/>
-                <w:sz w:val="14"/>
-              </w:rPr>
-              <w:t>One empty 7×6 board with seven drop controls</w:t>
+              <w:t>One empty 7×6 board with seven drop controls and cell names that identify position and token state</w:t>
             </w:r>
           </w:p>
         </w:tc>
@@ -2269,17 +2239,7 @@
             <w:vAlign w:val="center"/>
           </w:tcPr>
           <w:p>
-            <w:pPr>
-              <w:spacing w:after="0"/>
-            </w:pPr>
-            <w:r/>
             <w:r>
-              <w:rPr>
-                <w:rFonts w:ascii="Aptos" w:hAnsi="Aptos"/>
-                <w:b w:val="0"/>
-                <w:color w:val="344054"/>
-                <w:sz w:val="14"/>
-              </w:rPr>
               <w:t>Persistence</w:t>
             </w:r>
           </w:p>
@@ -2290,17 +2250,7 @@
             <w:vAlign w:val="center"/>
           </w:tcPr>
           <w:p>
-            <w:pPr>
-              <w:spacing w:after="0"/>
-            </w:pPr>
-            <w:r/>
             <w:r>
-              <w:rPr>
-                <w:rFonts w:ascii="Aptos" w:hAnsi="Aptos"/>
-                <w:b w:val="0"/>
-                <w:color w:val="344054"/>
-                <w:sz w:val="14"/>
-              </w:rPr>
               <w:t>Completed reload</w:t>
             </w:r>
           </w:p>
@@ -2311,18 +2261,8 @@
             <w:vAlign w:val="center"/>
           </w:tcPr>
           <w:p>
-            <w:pPr>
-              <w:spacing w:after="0"/>
-            </w:pPr>
-            <w:r/>
             <w:r>
-              <w:rPr>
-                <w:rFonts w:ascii="Aptos" w:hAnsi="Aptos"/>
-                <w:b w:val="0"/>
-                <w:color w:val="344054"/>
-                <w:sz w:val="14"/>
-              </w:rPr>
-              <w:t>Restore result without duplicate score</w:t>
+              <w:t>Restore the result without duplicate score and preserve score-aware terminal Undo/Redo</w:t>
             </w:r>
           </w:p>
         </w:tc>
@@ -2477,17 +2417,7 @@
             <w:shd w:fill="F3F5F7"/>
           </w:tcPr>
           <w:p>
-            <w:pPr>
-              <w:spacing w:after="0"/>
-            </w:pPr>
-            <w:r/>
             <w:r>
-              <w:rPr>
-                <w:rFonts w:ascii="Aptos" w:hAnsi="Aptos"/>
-                <w:b w:val="0"/>
-                <w:color w:val="344054"/>
-                <w:sz w:val="14"/>
-              </w:rPr>
               <w:t>Interface</w:t>
             </w:r>
           </w:p>
@@ -2499,18 +2429,8 @@
             <w:shd w:fill="F3F5F7"/>
           </w:tcPr>
           <w:p>
-            <w:pPr>
-              <w:spacing w:after="0"/>
-            </w:pPr>
-            <w:r/>
             <w:r>
-              <w:rPr>
-                <w:rFonts w:ascii="Aptos" w:hAnsi="Aptos"/>
-                <w:b w:val="0"/>
-                <w:color w:val="344054"/>
-                <w:sz w:val="14"/>
-              </w:rPr>
-              <w:t>Polish and responsive layout</w:t>
+              <w:t>Preview and motion</w:t>
             </w:r>
           </w:p>
         </w:tc>
@@ -2521,18 +2441,40 @@
             <w:shd w:fill="F3F5F7"/>
           </w:tcPr>
           <w:p>
-            <w:pPr>
-              <w:spacing w:after="0"/>
-            </w:pPr>
-            <w:r/>
             <w:r>
-              <w:rPr>
-                <w:rFonts w:ascii="Aptos" w:hAnsi="Aptos"/>
-                <w:b w:val="0"/>
-                <w:color w:val="344054"/>
-                <w:sz w:val="14"/>
-              </w:rPr>
-              <w:t>Preview, motion and narrow-screen usability</w:t>
+              <w:t>Show the active-color preview and finite drop motion, while suppressing nonessential motion under reduced-motion preferences</w:t>
+            </w:r>
+          </w:p>
+        </w:tc>
+      </w:tr>
+      <w:tr>
+        <w:tc>
+          <w:tcPr>
+            <w:tcW w:type="dxa" w:w="3331"/>
+          </w:tcPr>
+          <w:p>
+            <w:r>
+              <w:t>Interface</w:t>
+            </w:r>
+          </w:p>
+        </w:tc>
+        <w:tc>
+          <w:tcPr>
+            <w:tcW w:type="dxa" w:w="3331"/>
+          </w:tcPr>
+          <w:p>
+            <w:r>
+              <w:t>Responsive layout</w:t>
+            </w:r>
+          </w:p>
+        </w:tc>
+        <w:tc>
+          <w:tcPr>
+            <w:tcW w:type="dxa" w:w="3331"/>
+          </w:tcPr>
+          <w:p>
+            <w:r>
+              <w:t>Keep the complete board and primary controls usable at a narrow viewport</w:t>
             </w:r>
           </w:p>
         </w:tc>
@@ -3219,6 +3161,14 @@
         <w:pStyle w:val="ListNumber"/>
       </w:pPr>
       <w:r>
+        <w:t>Reload and confirm the result and score remain unchanged.</w:t>
+      </w:r>
+    </w:p>
+    <w:p>
+      <w:pPr>
+        <w:pStyle w:val="ListNumber"/>
+      </w:pPr>
+      <w:r>
         <w:t>Undo once.</w:t>
       </w:r>
     </w:p>
@@ -3241,18 +3191,18 @@
     <w:p>
       <w:pPr>
         <w:pStyle w:val="ListBullet"/>
-        <w:spacing w:after="40"/>
       </w:pPr>
       <w:r>
-        <w:t>Undo removes the final Red piece, reopens the round, and returns Red's score</w:t>
+        <w:t>Reload does not count the completed result again.</w:t>
       </w:r>
     </w:p>
     <w:p>
       <w:pPr>
-        <w:keepLines/>
+        <w:pStyle w:val="ListBullet"/>
+        <w:spacing w:after="40"/>
       </w:pPr>
       <w:r>
-        <w:t>to zero.</w:t>
+        <w:t>Undo after reload removes the final Red piece, reopens the round, and returns Red's score to zero.</w:t>
       </w:r>
     </w:p>
     <w:p>
@@ -3574,18 +3524,8 @@
             <w:vAlign w:val="center"/>
           </w:tcPr>
           <w:p>
-            <w:pPr>
-              <w:spacing w:after="0"/>
-            </w:pPr>
-            <w:r/>
             <w:r>
-              <w:rPr>
-                <w:rFonts w:ascii="Aptos" w:hAnsi="Aptos"/>
-                <w:b w:val="0"/>
-                <w:color w:val="344054"/>
-                <w:sz w:val="14"/>
-              </w:rPr>
-              <w:t>bootstrap_exact_board_and_controls</w:t>
+              <w:t>bootstrap_accessible_board_and_controls</w:t>
             </w:r>
           </w:p>
         </w:tc>
@@ -3595,18 +3535,8 @@
             <w:vAlign w:val="center"/>
           </w:tcPr>
           <w:p>
-            <w:pPr>
-              <w:spacing w:after="0"/>
-            </w:pPr>
-            <w:r/>
             <w:r>
-              <w:rPr>
-                <w:rFonts w:ascii="Aptos" w:hAnsi="Aptos"/>
-                <w:b w:val="0"/>
-                <w:color w:val="344054"/>
-                <w:sz w:val="14"/>
-              </w:rPr>
-              <w:t>Bootstrap / exact surface</w:t>
+              <w:t>Bootstrap / accessible surface</w:t>
             </w:r>
           </w:p>
         </w:tc>
@@ -3637,18 +3567,8 @@
             <w:vAlign w:val="center"/>
           </w:tcPr>
           <w:p>
-            <w:pPr>
-              <w:spacing w:after="0"/>
-            </w:pPr>
-            <w:r/>
             <w:r>
-              <w:rPr>
-                <w:rFonts w:ascii="Aptos" w:hAnsi="Aptos"/>
-                <w:b w:val="0"/>
-                <w:color w:val="344054"/>
-                <w:sz w:val="14"/>
-              </w:rPr>
-              <w:t>Require 42 cells, seven column controls, status, scores, history and match controls</w:t>
+              <w:t>Require 42 cells, seven column controls, status, scores, history and match controls; every cell must expose its row, column and empty/Red/Yellow state through an accessible name</w:t>
             </w:r>
           </w:p>
         </w:tc>
@@ -5936,18 +5856,8 @@
             <w:shd w:fill="F3F5F7"/>
           </w:tcPr>
           <w:p>
-            <w:pPr>
-              <w:spacing w:after="0"/>
-            </w:pPr>
-            <w:r/>
             <w:r>
-              <w:rPr>
-                <w:rFonts w:ascii="Aptos" w:hAnsi="Aptos"/>
-                <w:b w:val="0"/>
-                <w:color w:val="344054"/>
-                <w:sz w:val="14"/>
-              </w:rPr>
-              <w:t>completed_reload_does_not_double_count</w:t>
+              <w:t>completed_reload_undo_redo_score_recovery</w:t>
             </w:r>
           </w:p>
         </w:tc>
@@ -5958,18 +5868,8 @@
             <w:shd w:fill="F3F5F7"/>
           </w:tcPr>
           <w:p>
-            <w:pPr>
-              <w:spacing w:after="0"/>
-            </w:pPr>
-            <w:r/>
             <w:r>
-              <w:rPr>
-                <w:rFonts w:ascii="Aptos" w:hAnsi="Aptos"/>
-                <w:b w:val="0"/>
-                <w:color w:val="344054"/>
-                <w:sz w:val="14"/>
-              </w:rPr>
-              <w:t>Persistence / terminal round</w:t>
+              <w:t>Persistence / terminal recovery</w:t>
             </w:r>
           </w:p>
         </w:tc>
@@ -6002,18 +5902,8 @@
             <w:shd w:fill="F3F5F7"/>
           </w:tcPr>
           <w:p>
-            <w:pPr>
-              <w:spacing w:after="0"/>
-            </w:pPr>
-            <w:r/>
             <w:r>
-              <w:rPr>
-                <w:rFonts w:ascii="Aptos" w:hAnsi="Aptos"/>
-                <w:b w:val="0"/>
-                <w:color w:val="344054"/>
-                <w:sz w:val="14"/>
-              </w:rPr>
-              <w:t>Repeated reloads retain one result increment</w:t>
+              <w:t>Repeated reloads retain one result increment; Undo after reload reopens the round and reverses the score, and Redo restores both exactly once</w:t>
             </w:r>
           </w:p>
         </w:tc>
@@ -6274,18 +6164,8 @@
             <w:vAlign w:val="center"/>
           </w:tcPr>
           <w:p>
-            <w:pPr>
-              <w:spacing w:after="0"/>
-            </w:pPr>
-            <w:r/>
             <w:r>
-              <w:rPr>
-                <w:rFonts w:ascii="Aptos" w:hAnsi="Aptos"/>
-                <w:b w:val="0"/>
-                <w:color w:val="344054"/>
-                <w:sz w:val="14"/>
-              </w:rPr>
-              <w:t>hover_preview_and_drop_motion</w:t>
+              <w:t>preview_drop_motion_and_reduced_motion</w:t>
             </w:r>
           </w:p>
         </w:tc>
@@ -6295,18 +6175,8 @@
             <w:vAlign w:val="center"/>
           </w:tcPr>
           <w:p>
-            <w:pPr>
-              <w:spacing w:after="0"/>
-            </w:pPr>
-            <w:r/>
             <w:r>
-              <w:rPr>
-                <w:rFonts w:ascii="Aptos" w:hAnsi="Aptos"/>
-                <w:b w:val="0"/>
-                <w:color w:val="344054"/>
-                <w:sz w:val="14"/>
-              </w:rPr>
-              <w:t>Interface / interaction polish</w:t>
+              <w:t>Interface / interaction motion</w:t>
             </w:r>
           </w:p>
         </w:tc>
@@ -6337,18 +6207,8 @@
             <w:vAlign w:val="center"/>
           </w:tcPr>
           <w:p>
-            <w:pPr>
-              <w:spacing w:after="0"/>
-            </w:pPr>
-            <w:r/>
             <w:r>
-              <w:rPr>
-                <w:rFonts w:ascii="Aptos" w:hAnsi="Aptos"/>
-                <w:b w:val="0"/>
-                <w:color w:val="344054"/>
-                <w:sz w:val="14"/>
-              </w:rPr>
-              <w:t>Visible preview matches active color and accepted token has finite drop motion</w:t>
+              <w:t>Visible preview matches the active color, an accepted token has finite drop motion normally, and emulated reduced-motion preference suppresses nonessential motion without changing placement</w:t>
             </w:r>
           </w:p>
         </w:tc>

</xml_diff>